<commit_message>
Embed flowchart in realistic course design fixture
</commit_message>
<xml_diff>
--- a/examples/realistic-report-fixtures/course-design-full-example.docx
+++ b/examples/realistic-report-fixtures/course-design-full-example.docx
@@ -1724,7 +1724,7 @@
       <w:r>
         <w:drawing>
           <wp:inline xmlns:a="http://schemas.openxmlformats.org/drawingml/2006/main" xmlns:pic="http://schemas.openxmlformats.org/drawingml/2006/picture">
-            <wp:extent cx="4140000" cy="1656000"/>
+            <wp:extent cx="4140000" cy="5855143"/>
             <wp:docPr id="2" name="Picture 2"/>
             <wp:cNvGraphicFramePr>
               <a:graphicFrameLocks noChangeAspect="1"/>
@@ -1733,7 +1733,7 @@
               <a:graphicData uri="http://schemas.openxmlformats.org/drawingml/2006/picture">
                 <pic:pic>
                   <pic:nvPicPr>
-                    <pic:cNvPr id="0" name="flow.png"/>
+                    <pic:cNvPr id="0" name="student-course-selection-flowchart.png"/>
                     <pic:cNvPicPr/>
                   </pic:nvPicPr>
                   <pic:blipFill>
@@ -1745,7 +1745,7 @@
                   <pic:spPr>
                     <a:xfrm>
                       <a:off x="0" y="0"/>
-                      <a:ext cx="4140000" cy="1656000"/>
+                      <a:ext cx="4140000" cy="5855143"/>
                     </a:xfrm>
                     <a:prstGeom prst="rect"/>
                   </pic:spPr>

</xml_diff>

<commit_message>
Improve course-design report fastline fidelity
</commit_message>
<xml_diff>
--- a/examples/realistic-report-fixtures/course-design-full-example.docx
+++ b/examples/realistic-report-fixtures/course-design-full-example.docx
@@ -739,7 +739,34 @@
           <w:b/>
           <w:sz w:val="24"/>
         </w:rPr>
-        <w:t>2.1 需求分析</w:t>
+        <w:t>2.1 开发环境</w:t>
+      </w:r>
+    </w:p>
+    <w:p>
+      <w:pPr>
+        <w:spacing w:before="0" w:after="80" w:line="348" w:lineRule="auto"/>
+        <w:ind w:firstLine="420"/>
+      </w:pPr>
+      <w:r>
+        <w:rPr>
+          <w:rFonts w:ascii="Times New Roman" w:hAnsi="Times New Roman" w:eastAsia="SimSun"/>
+          <w:b w:val="0"/>
+          <w:sz w:val="22"/>
+        </w:rPr>
+        <w:t>课程设计在 Windows 11、Python 3、SQLite 和 VS Code 环境下完成。SQLite 用于保存学生、教师、课程和选课记录，便于在本地快速演示和验证核心业务流程。</w:t>
+      </w:r>
+    </w:p>
+    <w:p>
+      <w:pPr>
+        <w:spacing w:before="120" w:after="80" w:line="288" w:lineRule="auto"/>
+      </w:pPr>
+      <w:r>
+        <w:rPr>
+          <w:rFonts w:ascii="Times New Roman" w:hAnsi="Times New Roman" w:eastAsia="SimSun"/>
+          <w:b/>
+          <w:sz w:val="24"/>
+        </w:rPr>
+        <w:t>2.2 需求分析</w:t>
       </w:r>
     </w:p>
     <w:p>
@@ -807,7 +834,7 @@
           <w:b w:val="0"/>
           <w:sz w:val="20"/>
         </w:rPr>
-        <w:t>图2-1 系统功能结构图</w:t>
+        <w:t>图1 系统功能结构图</w:t>
       </w:r>
     </w:p>
     <w:p>
@@ -820,7 +847,7 @@
           <w:b/>
           <w:sz w:val="24"/>
         </w:rPr>
-        <w:t>2.2 总体设计</w:t>
+        <w:t>2.3 总体设计</w:t>
       </w:r>
     </w:p>
     <w:p>
@@ -1172,7 +1199,7 @@
           <w:b/>
           <w:sz w:val="24"/>
         </w:rPr>
-        <w:t>2.3 数据库设计</w:t>
+        <w:t>2.4 数据库设计</w:t>
       </w:r>
     </w:p>
     <w:p>
@@ -1699,7 +1726,7 @@
           <w:b/>
           <w:sz w:val="24"/>
         </w:rPr>
-        <w:t>2.4 详细设计与实现</w:t>
+        <w:t>2.5 详细设计与实现</w:t>
       </w:r>
     </w:p>
     <w:p>
@@ -1767,7 +1794,7 @@
           <w:b w:val="0"/>
           <w:sz w:val="20"/>
         </w:rPr>
-        <w:t>图4-1 学生选课流程图</w:t>
+        <w:t>图2 学生选课流程图</w:t>
       </w:r>
     </w:p>
     <w:p>
@@ -1780,7 +1807,7 @@
           <w:b/>
           <w:sz w:val="24"/>
         </w:rPr>
-        <w:t>2.5 测试结果</w:t>
+        <w:t>2.6 测试结果</w:t>
       </w:r>
     </w:p>
     <w:tbl>
@@ -2177,7 +2204,34 @@
           <w:b w:val="0"/>
           <w:sz w:val="20"/>
         </w:rPr>
-        <w:t>图5-1 运行结果与测试输出</w:t>
+        <w:t>图3 运行结果与测试输出</w:t>
+      </w:r>
+    </w:p>
+    <w:p>
+      <w:pPr>
+        <w:spacing w:before="120" w:after="80" w:line="288" w:lineRule="auto"/>
+      </w:pPr>
+      <w:r>
+        <w:rPr>
+          <w:rFonts w:ascii="Times New Roman" w:hAnsi="Times New Roman" w:eastAsia="SimSun"/>
+          <w:b/>
+          <w:sz w:val="24"/>
+        </w:rPr>
+        <w:t>2.7 问题与改进</w:t>
+      </w:r>
+    </w:p>
+    <w:p>
+      <w:pPr>
+        <w:spacing w:before="0" w:after="80" w:line="348" w:lineRule="auto"/>
+        <w:ind w:firstLine="420"/>
+      </w:pPr>
+      <w:r>
+        <w:rPr>
+          <w:rFonts w:ascii="Times New Roman" w:hAnsi="Times New Roman" w:eastAsia="SimSun"/>
+          <w:b w:val="0"/>
+          <w:sz w:val="22"/>
+        </w:rPr>
+        <w:t>当前样例系统重点验证主流程，异常提示、日志记录和并发访问仍较简单。后续可以补充分页查询、课程推荐、权限细分和数据库事务处理，使系统更接近真实部署场景。</w:t>
       </w:r>
     </w:p>
     <w:p>

</xml_diff>